<commit_message>
Second Version, Solve issues
</commit_message>
<xml_diff>
--- a/Estructura Pagina Web.docx
+++ b/Estructura Pagina Web.docx
@@ -124,10 +124,7 @@
       </w:r>
       <w:proofErr w:type="spellStart"/>
       <w:r>
-        <w:t>L</w:t>
-      </w:r>
-      <w:r>
-        <w:t>uxury</w:t>
+        <w:t>Luxury</w:t>
       </w:r>
       <w:proofErr w:type="spellEnd"/>
     </w:p>
@@ -1130,6 +1127,213 @@
       </w:r>
     </w:p>
     <w:p>
+      <w:r>
+        <w:t xml:space="preserve"> </w:t>
+      </w:r>
+      <w:r>
+        <w:t>Tours</w:t>
+      </w:r>
+    </w:p>
+    <w:p>
+      <w:pPr>
+        <w:pStyle w:val="Prrafodelista"/>
+        <w:numPr>
+          <w:ilvl w:val="0"/>
+          <w:numId w:val="1"/>
+        </w:numPr>
+      </w:pPr>
+      <w:r>
+        <w:lastRenderedPageBreak/>
+        <w:t>Tradicionales</w:t>
+      </w:r>
+    </w:p>
+    <w:p>
+      <w:pPr>
+        <w:pStyle w:val="Prrafodelista"/>
+        <w:numPr>
+          <w:ilvl w:val="0"/>
+          <w:numId w:val="1"/>
+        </w:numPr>
+      </w:pPr>
+      <w:r>
+        <w:t xml:space="preserve"> Islas del rosario </w:t>
+      </w:r>
+    </w:p>
+    <w:p>
+      <w:pPr>
+        <w:pStyle w:val="Prrafodelista"/>
+        <w:numPr>
+          <w:ilvl w:val="0"/>
+          <w:numId w:val="1"/>
+        </w:numPr>
+      </w:pPr>
+      <w:r>
+        <w:t xml:space="preserve"> </w:t>
+      </w:r>
+      <w:proofErr w:type="spellStart"/>
+      <w:r>
+        <w:t>Luxury</w:t>
+      </w:r>
+      <w:proofErr w:type="spellEnd"/>
+    </w:p>
+    <w:p>
+      <w:pPr>
+        <w:ind w:left="404"/>
+      </w:pPr>
+      <w:r>
+        <w:t xml:space="preserve"> </w:t>
+      </w:r>
+      <w:r>
+        <w:rPr>
+          <w:rFonts w:ascii="Segoe UI Emoji" w:hAnsi="Segoe UI Emoji" w:cs="Segoe UI Emoji"/>
+        </w:rPr>
+        <w:t>✨</w:t>
+      </w:r>
+      <w:r>
+        <w:t xml:space="preserve"> Experiencias Premium </w:t>
+      </w:r>
+    </w:p>
+    <w:p>
+      <w:pPr>
+        <w:pStyle w:val="Prrafodelista"/>
+        <w:numPr>
+          <w:ilvl w:val="0"/>
+          <w:numId w:val="3"/>
+        </w:numPr>
+      </w:pPr>
+      <w:r>
+        <w:t xml:space="preserve">Yates y botes deportivos </w:t>
+      </w:r>
+    </w:p>
+    <w:p>
+      <w:pPr>
+        <w:pStyle w:val="Prrafodelista"/>
+        <w:numPr>
+          <w:ilvl w:val="0"/>
+          <w:numId w:val="3"/>
+        </w:numPr>
+      </w:pPr>
+      <w:r>
+        <w:t>Cenas privadas</w:t>
+      </w:r>
+    </w:p>
+    <w:p>
+      <w:pPr>
+        <w:pStyle w:val="Prrafodelista"/>
+        <w:numPr>
+          <w:ilvl w:val="0"/>
+          <w:numId w:val="3"/>
+        </w:numPr>
+      </w:pPr>
+      <w:r>
+        <w:t>B</w:t>
+      </w:r>
+      <w:r>
+        <w:t xml:space="preserve">uceo </w:t>
+      </w:r>
+    </w:p>
+    <w:p>
+      <w:pPr>
+        <w:ind w:left="404"/>
+      </w:pPr>
+      <w:r>
+        <w:rPr>
+          <w:rFonts w:ascii="Segoe UI Emoji" w:hAnsi="Segoe UI Emoji" w:cs="Segoe UI Emoji"/>
+        </w:rPr>
+        <w:t>🛎️</w:t>
+      </w:r>
+      <w:r>
+        <w:t xml:space="preserve"> Servicios Exclusivos </w:t>
+      </w:r>
+    </w:p>
+    <w:p>
+      <w:pPr>
+        <w:pStyle w:val="Prrafodelista"/>
+        <w:numPr>
+          <w:ilvl w:val="0"/>
+          <w:numId w:val="2"/>
+        </w:numPr>
+      </w:pPr>
+      <w:r>
+        <w:t xml:space="preserve">Alojamiento </w:t>
+      </w:r>
+    </w:p>
+    <w:p>
+      <w:pPr>
+        <w:pStyle w:val="Prrafodelista"/>
+        <w:numPr>
+          <w:ilvl w:val="0"/>
+          <w:numId w:val="2"/>
+        </w:numPr>
+      </w:pPr>
+      <w:r>
+        <w:t xml:space="preserve">Transporte privado </w:t>
+      </w:r>
+    </w:p>
+    <w:p>
+      <w:pPr>
+        <w:pStyle w:val="Prrafodelista"/>
+        <w:numPr>
+          <w:ilvl w:val="0"/>
+          <w:numId w:val="2"/>
+        </w:numPr>
+      </w:pPr>
+      <w:r>
+        <w:t xml:space="preserve">Decoración (cumpleaños, romántico, etc.) </w:t>
+      </w:r>
+    </w:p>
+    <w:p>
+      <w:pPr>
+        <w:pStyle w:val="Prrafodelista"/>
+        <w:numPr>
+          <w:ilvl w:val="0"/>
+          <w:numId w:val="2"/>
+        </w:numPr>
+      </w:pPr>
+      <w:r>
+        <w:t xml:space="preserve">Fotografía y video </w:t>
+      </w:r>
+    </w:p>
+    <w:p>
+      <w:r>
+        <w:t xml:space="preserve">cambia la sección de ofertas y descuentos de todos los tours para que sea llamativo y que no ocupe mucho espacio, no </w:t>
+      </w:r>
+      <w:proofErr w:type="spellStart"/>
+      <w:r>
+        <w:t>se</w:t>
+      </w:r>
+      <w:proofErr w:type="spellEnd"/>
+      <w:r>
+        <w:t xml:space="preserve"> si sea mejor poner una animación</w:t>
+      </w:r>
+    </w:p>
+    <w:p/>
+    <w:p>
+      <w:r>
+        <w:t xml:space="preserve">La sección en donde queda Cartagena, por favor cambia esa imagen, encuentra una llamativa con un mapa de donde este ubicado, las personas deben tener ganas de conocer </w:t>
+      </w:r>
+      <w:proofErr w:type="spellStart"/>
+      <w:r>
+        <w:t>cartagena</w:t>
+      </w:r>
+      <w:proofErr w:type="spellEnd"/>
+      <w:r>
+        <w:t xml:space="preserve"> </w:t>
+      </w:r>
+      <w:r>
+        <w:tab/>
+      </w:r>
+    </w:p>
+    <w:p/>
+    <w:p>
+      <w:r>
+        <w:t xml:space="preserve">Crea las </w:t>
+      </w:r>
+      <w:proofErr w:type="spellStart"/>
+      <w:r>
+        <w:t>cards</w:t>
+      </w:r>
+      <w:proofErr w:type="spellEnd"/>
       <w:r>
         <w:t xml:space="preserve"> </w:t>
       </w:r>

</xml_diff>